<commit_message>
add Live Posture Check (row 14) to Fluxo_App.docx workout section
Documents the Workout screen's camera-based posture feature:
- Live mode: MediaPipe Pose real-time shoulder/spine/hip alignment
  overlay on camera feed via requestAnimationFrame + canvas
- Record & Review mode: MediaRecorder captures composite canvas
  (video + skeleton at 10fps), formCheckFeedbackLog timestamps
  each correction cue, replay + timeline shown on stop,
  downloadable .mp4/.webm
- Error handling: toast on camera deny or MediaPipe init failure
Subsequent row numbers incremented accordingly.

Co-Authored-By: Claude Sonnet 4.6 <noreply@anthropic.com>
</commit_message>
<xml_diff>
--- a/Fluxo_App.docx
+++ b/Fluxo_App.docx
@@ -1194,6 +1194,119 @@
         <w:tc>
           <w:tcPr>
             <w:tcW w:type="dxa" w:w="2040"/>
+            <w:shd w:val="clear" w:color="auto" w:fill="FFFFFF"/>
+            <w:vAlign w:val="top"/>
+            <w:shd w:val="clear" w:color="auto" w:fill="FFFFFF"/>
+          </w:tcPr>
+          <w:p>
+            <w:r>
+              <w:rPr>
+                <w:b/>
+                <w:color w:val="1A2540"/>
+                <w:sz w:val="20"/>
+              </w:rPr>
+              <w:t>15</w:t>
+            </w:r>
+          </w:p>
+        </w:tc>
+        <w:tc>
+          <w:tcPr>
+            <w:tcW w:type="dxa" w:w="2040"/>
+            <w:shd w:val="clear" w:color="auto" w:fill="FFFFFF"/>
+            <w:vAlign w:val="top"/>
+          </w:tcPr>
+          <w:p>
+            <w:r>
+              <w:rPr>
+                <w:b/>
+                <w:color w:val="1A2540"/>
+                <w:sz w:val="20"/>
+              </w:rPr>
+              <w:t>Verificação de Postura ao Vivo  Ecrã 6</w:t>
+              <w:br/>
+              <w:t>(Live Posture Check)</w:t>
+            </w:r>
+          </w:p>
+        </w:tc>
+        <w:tc>
+          <w:tcPr>
+            <w:tcW w:type="dxa" w:w="2040"/>
+            <w:shd w:val="clear" w:color="auto" w:fill="FFFFFF"/>
+            <w:vAlign w:val="top"/>
+          </w:tcPr>
+          <w:p>
+            <w:r>
+              <w:rPr>
+                <w:b w:val="0"/>
+                <w:color w:val="1A2540"/>
+                <w:sz w:val="20"/>
+              </w:rPr>
+              <w:t>Clica [Verificar Postura ao Vivo]</w:t>
+              <w:br/>
+              <w:t>Escolhe modo: Ao Vivo OU Gravar &amp; Rever</w:t>
+            </w:r>
+          </w:p>
+        </w:tc>
+        <w:tc>
+          <w:tcPr>
+            <w:tcW w:type="dxa" w:w="2040"/>
+            <w:shd w:val="clear" w:color="auto" w:fill="FFFFFF"/>
+            <w:vAlign w:val="top"/>
+          </w:tcPr>
+          <w:p>
+            <w:r>
+              <w:rPr>
+                <w:b w:val="0"/>
+                <w:color w:val="1A2540"/>
+                <w:sz w:val="20"/>
+              </w:rPr>
+              <w:t>Modo Ao Vivo:</w:t>
+              <w:br/>
+              <w:t>• Câmara abre via getUserMedia; MediaPipe Pose corre em tempo real (requestAnimationFrame)</w:t>
+              <w:br/>
+              <w:t>• analyzeExerciseForm(): avalia alinhamento de ombros, coluna e ancas</w:t>
+              <w:br/>
+              <w:t>• Sobreposição de esqueleto + indicadores de correção em canvas ao vivo</w:t>
+              <w:br/>
+              <w:br/>
+              <w:t>Modo Gravar &amp; Rever:</w:t>
+              <w:br/>
+              <w:t>• MediaRecorder grava canvas composto (vídeo + esqueleto a 10fps)</w:t>
+              <w:br/>
+              <w:t>• Registo temporal de feedback (formCheckFeedbackLog) em cada frame</w:t>
+              <w:br/>
+              <w:t>• Ao parar: reprodução do vídeo gravado + linha cronológica de alertas de postura</w:t>
+              <w:br/>
+              <w:t>• Botão [Descarregar Vídeo] exporta .mp4/.webm localmente</w:t>
+            </w:r>
+          </w:p>
+        </w:tc>
+        <w:tc>
+          <w:tcPr>
+            <w:tcW w:type="dxa" w:w="2040"/>
+            <w:shd w:val="clear" w:color="auto" w:fill="FFFFFF"/>
+            <w:vAlign w:val="top"/>
+          </w:tcPr>
+          <w:p>
+            <w:r>
+              <w:rPr>
+                <w:b w:val="0"/>
+                <w:color w:val="1A2540"/>
+                <w:sz w:val="20"/>
+              </w:rPr>
+              <w:t>[Fechar] para ao vivo; [Parar &amp; Rever] guarda o vídeo</w:t>
+              <w:br/>
+              <w:t>Sem pontos — foco em segurança / forma</w:t>
+              <w:br/>
+              <w:t>Fallback: toast de erro se câmara negada ou MediaPipe falhar</w:t>
+            </w:r>
+          </w:p>
+        </w:tc>
+      </w:tr>
+      <w:tr>
+        <w:tc>
+          <w:tcPr>
+            <w:tcW w:type="dxa" w:w="2040"/>
             <w:shd w:val="clear" w:color="auto" w:fill="F8F9FF"/>
             <w:vAlign w:val="top"/>
           </w:tcPr>
@@ -1394,6 +1507,7 @@
             <w:tcW w:type="dxa" w:w="2040"/>
             <w:shd w:val="clear" w:color="auto" w:fill="FFFFFF"/>
             <w:vAlign w:val="top"/>
+            <w:shd w:val="clear" w:color="auto" w:fill="FFFFFF"/>
           </w:tcPr>
           <w:p>
             <w:r>
@@ -1402,7 +1516,7 @@
                 <w:color w:val="1A2540"/>
                 <w:sz w:val="20"/>
               </w:rPr>
-              <w:t>14</w:t>
+              <w:t>15</w:t>
             </w:r>
           </w:p>
         </w:tc>
@@ -1481,6 +1595,7 @@
             <w:tcW w:type="dxa" w:w="2040"/>
             <w:shd w:val="clear" w:color="auto" w:fill="F8F9FF"/>
             <w:vAlign w:val="top"/>
+            <w:shd w:val="clear" w:color="auto" w:fill="FFFFFF"/>
           </w:tcPr>
           <w:p>
             <w:r>
@@ -1489,7 +1604,7 @@
                 <w:color w:val="1A2540"/>
                 <w:sz w:val="20"/>
               </w:rPr>
-              <w:t>15</w:t>
+              <w:t>16</w:t>
             </w:r>
           </w:p>
         </w:tc>
@@ -1568,6 +1683,7 @@
             <w:tcW w:type="dxa" w:w="2040"/>
             <w:shd w:val="clear" w:color="auto" w:fill="FFFFFF"/>
             <w:vAlign w:val="top"/>
+            <w:shd w:val="clear" w:color="auto" w:fill="FFFFFF"/>
           </w:tcPr>
           <w:p>
             <w:r>
@@ -1576,7 +1692,7 @@
                 <w:color w:val="1A2540"/>
                 <w:sz w:val="20"/>
               </w:rPr>
-              <w:t>16</w:t>
+              <w:t>17</w:t>
             </w:r>
           </w:p>
         </w:tc>
@@ -1677,6 +1793,7 @@
             <w:tcW w:type="dxa" w:w="2040"/>
             <w:shd w:val="clear" w:color="auto" w:fill="FFFFFF"/>
             <w:vAlign w:val="top"/>
+            <w:shd w:val="clear" w:color="auto" w:fill="FFFFFF"/>
           </w:tcPr>
           <w:p>
             <w:r>
@@ -1685,7 +1802,7 @@
                 <w:color w:val="1A2540"/>
                 <w:sz w:val="20"/>
               </w:rPr>
-              <w:t>17</w:t>
+              <w:t>18</w:t>
             </w:r>
           </w:p>
         </w:tc>
@@ -1764,6 +1881,7 @@
             <w:tcW w:type="dxa" w:w="2040"/>
             <w:shd w:val="clear" w:color="auto" w:fill="F8F9FF"/>
             <w:vAlign w:val="top"/>
+            <w:shd w:val="clear" w:color="auto" w:fill="FFFFFF"/>
           </w:tcPr>
           <w:p>
             <w:r>
@@ -1772,7 +1890,7 @@
                 <w:color w:val="1A2540"/>
                 <w:sz w:val="20"/>
               </w:rPr>
-              <w:t>18</w:t>
+              <w:t>19</w:t>
             </w:r>
           </w:p>
         </w:tc>
@@ -1873,6 +1991,7 @@
             <w:tcW w:type="dxa" w:w="2040"/>
             <w:shd w:val="clear" w:color="auto" w:fill="FFFFFF"/>
             <w:vAlign w:val="top"/>
+            <w:shd w:val="clear" w:color="auto" w:fill="FFFFFF"/>
           </w:tcPr>
           <w:p>
             <w:r>
@@ -1881,7 +2000,7 @@
                 <w:color w:val="1A2540"/>
                 <w:sz w:val="20"/>
               </w:rPr>
-              <w:t>19</w:t>
+              <w:t>20</w:t>
             </w:r>
           </w:p>
         </w:tc>
@@ -1960,6 +2079,7 @@
             <w:tcW w:type="dxa" w:w="2040"/>
             <w:shd w:val="clear" w:color="auto" w:fill="F8F9FF"/>
             <w:vAlign w:val="top"/>
+            <w:shd w:val="clear" w:color="auto" w:fill="FFFFFF"/>
           </w:tcPr>
           <w:p>
             <w:r>
@@ -1968,7 +2088,7 @@
                 <w:color w:val="1A2540"/>
                 <w:sz w:val="20"/>
               </w:rPr>
-              <w:t>20</w:t>
+              <w:t>21</w:t>
             </w:r>
           </w:p>
         </w:tc>
@@ -2047,6 +2167,7 @@
             <w:tcW w:type="dxa" w:w="2040"/>
             <w:shd w:val="clear" w:color="auto" w:fill="FFFFFF"/>
             <w:vAlign w:val="top"/>
+            <w:shd w:val="clear" w:color="auto" w:fill="FFFFFF"/>
           </w:tcPr>
           <w:p>
             <w:r>
@@ -2055,7 +2176,7 @@
                 <w:color w:val="1A2540"/>
                 <w:sz w:val="20"/>
               </w:rPr>
-              <w:t>21</w:t>
+              <w:t>22</w:t>
             </w:r>
           </w:p>
         </w:tc>
@@ -2134,6 +2255,7 @@
             <w:tcW w:type="dxa" w:w="2040"/>
             <w:shd w:val="clear" w:color="auto" w:fill="F8F9FF"/>
             <w:vAlign w:val="top"/>
+            <w:shd w:val="clear" w:color="auto" w:fill="FFFFFF"/>
           </w:tcPr>
           <w:p>
             <w:r>
@@ -2142,7 +2264,7 @@
                 <w:color w:val="1A2540"/>
                 <w:sz w:val="20"/>
               </w:rPr>
-              <w:t>22</w:t>
+              <w:t>23</w:t>
             </w:r>
           </w:p>
         </w:tc>
@@ -2221,6 +2343,7 @@
             <w:tcW w:type="dxa" w:w="2040"/>
             <w:shd w:val="clear" w:color="auto" w:fill="FFFFFF"/>
             <w:vAlign w:val="top"/>
+            <w:shd w:val="clear" w:color="auto" w:fill="FFFFFF"/>
           </w:tcPr>
           <w:p>
             <w:r>
@@ -2229,7 +2352,7 @@
                 <w:color w:val="1A2540"/>
                 <w:sz w:val="20"/>
               </w:rPr>
-              <w:t>23</w:t>
+              <w:t>24</w:t>
             </w:r>
           </w:p>
         </w:tc>
@@ -2308,6 +2431,7 @@
             <w:tcW w:type="dxa" w:w="2040"/>
             <w:shd w:val="clear" w:color="auto" w:fill="F8F9FF"/>
             <w:vAlign w:val="top"/>
+            <w:shd w:val="clear" w:color="auto" w:fill="FFFFFF"/>
           </w:tcPr>
           <w:p>
             <w:r>
@@ -2316,7 +2440,7 @@
                 <w:color w:val="1A2540"/>
                 <w:sz w:val="20"/>
               </w:rPr>
-              <w:t>24</w:t>
+              <w:t>25</w:t>
             </w:r>
           </w:p>
         </w:tc>
@@ -2417,6 +2541,7 @@
             <w:tcW w:type="dxa" w:w="2040"/>
             <w:shd w:val="clear" w:color="auto" w:fill="FFFFFF"/>
             <w:vAlign w:val="top"/>
+            <w:shd w:val="clear" w:color="auto" w:fill="FFFFFF"/>
           </w:tcPr>
           <w:p>
             <w:r>
@@ -2425,7 +2550,7 @@
                 <w:color w:val="1A2540"/>
                 <w:sz w:val="20"/>
               </w:rPr>
-              <w:t>25</w:t>
+              <w:t>26</w:t>
             </w:r>
           </w:p>
         </w:tc>
@@ -2506,6 +2631,7 @@
             <w:tcW w:type="dxa" w:w="2040"/>
             <w:shd w:val="clear" w:color="auto" w:fill="F8F9FF"/>
             <w:vAlign w:val="top"/>
+            <w:shd w:val="clear" w:color="auto" w:fill="FFFFFF"/>
           </w:tcPr>
           <w:p>
             <w:r>
@@ -2514,7 +2640,7 @@
                 <w:color w:val="1A2540"/>
                 <w:sz w:val="20"/>
               </w:rPr>
-              <w:t>26</w:t>
+              <w:t>27</w:t>
             </w:r>
           </w:p>
         </w:tc>
@@ -2593,6 +2719,7 @@
             <w:tcW w:type="dxa" w:w="2040"/>
             <w:shd w:val="clear" w:color="auto" w:fill="FFFFFF"/>
             <w:vAlign w:val="top"/>
+            <w:shd w:val="clear" w:color="auto" w:fill="FFFFFF"/>
           </w:tcPr>
           <w:p>
             <w:r>
@@ -2601,7 +2728,7 @@
                 <w:color w:val="1A2540"/>
                 <w:sz w:val="20"/>
               </w:rPr>
-              <w:t>27</w:t>
+              <w:t>28</w:t>
             </w:r>
           </w:p>
         </w:tc>
@@ -2702,6 +2829,7 @@
             <w:tcW w:type="dxa" w:w="2040"/>
             <w:shd w:val="clear" w:color="auto" w:fill="FFFFFF"/>
             <w:vAlign w:val="top"/>
+            <w:shd w:val="clear" w:color="auto" w:fill="FFFFFF"/>
           </w:tcPr>
           <w:p>
             <w:r>
@@ -2710,7 +2838,7 @@
                 <w:color w:val="1A2540"/>
                 <w:sz w:val="20"/>
               </w:rPr>
-              <w:t>28</w:t>
+              <w:t>29</w:t>
             </w:r>
           </w:p>
         </w:tc>
@@ -2817,6 +2945,7 @@
             <w:tcW w:type="dxa" w:w="2040"/>
             <w:shd w:val="clear" w:color="auto" w:fill="FFFFFF"/>
             <w:vAlign w:val="top"/>
+            <w:shd w:val="clear" w:color="auto" w:fill="FFFFFF"/>
           </w:tcPr>
           <w:p>
             <w:r>
@@ -2825,7 +2954,7 @@
                 <w:color w:val="1A2540"/>
                 <w:sz w:val="20"/>
               </w:rPr>
-              <w:t>29</w:t>
+              <w:t>30</w:t>
             </w:r>
           </w:p>
         </w:tc>
@@ -2906,6 +3035,7 @@
             <w:tcW w:type="dxa" w:w="2040"/>
             <w:shd w:val="clear" w:color="auto" w:fill="F8F9FF"/>
             <w:vAlign w:val="top"/>
+            <w:shd w:val="clear" w:color="auto" w:fill="FFFFFF"/>
           </w:tcPr>
           <w:p>
             <w:r>
@@ -2914,7 +3044,7 @@
                 <w:color w:val="1A2540"/>
                 <w:sz w:val="20"/>
               </w:rPr>
-              <w:t>30</w:t>
+              <w:t>31</w:t>
             </w:r>
           </w:p>
         </w:tc>
@@ -2993,6 +3123,7 @@
             <w:tcW w:type="dxa" w:w="2040"/>
             <w:shd w:val="clear" w:color="auto" w:fill="FFFFFF"/>
             <w:vAlign w:val="top"/>
+            <w:shd w:val="clear" w:color="auto" w:fill="FFFFFF"/>
           </w:tcPr>
           <w:p>
             <w:r>
@@ -3001,7 +3132,7 @@
                 <w:color w:val="1A2540"/>
                 <w:sz w:val="20"/>
               </w:rPr>
-              <w:t>31</w:t>
+              <w:t>32</w:t>
             </w:r>
           </w:p>
         </w:tc>
@@ -3080,6 +3211,7 @@
             <w:tcW w:type="dxa" w:w="2040"/>
             <w:shd w:val="clear" w:color="auto" w:fill="F8F9FF"/>
             <w:vAlign w:val="top"/>
+            <w:shd w:val="clear" w:color="auto" w:fill="FFFFFF"/>
           </w:tcPr>
           <w:p>
             <w:r>
@@ -3088,7 +3220,7 @@
                 <w:color w:val="1A2540"/>
                 <w:sz w:val="20"/>
               </w:rPr>
-              <w:t>32</w:t>
+              <w:t>33</w:t>
             </w:r>
           </w:p>
         </w:tc>
@@ -3167,6 +3299,7 @@
             <w:tcW w:type="dxa" w:w="2040"/>
             <w:shd w:val="clear" w:color="auto" w:fill="FFFFFF"/>
             <w:vAlign w:val="top"/>
+            <w:shd w:val="clear" w:color="auto" w:fill="FFFFFF"/>
           </w:tcPr>
           <w:p>
             <w:r>
@@ -3175,7 +3308,7 @@
                 <w:color w:val="1A2540"/>
                 <w:sz w:val="20"/>
               </w:rPr>
-              <w:t>33</w:t>
+              <w:t>34</w:t>
             </w:r>
           </w:p>
         </w:tc>

</xml_diff>